<commit_message>
Upload pdf, docx, and pptx
</commit_message>
<xml_diff>
--- a/CSE 430_ProjectMobile_HeartHealth_2131200071_NguyenHoangGiang.docx
+++ b/CSE 430_ProjectMobile_HeartHealth_2131200071_NguyenHoangGiang.docx
@@ -387,8 +387,6 @@
         </w:rPr>
         <w:t>Trần Văn Tài</w:t>
       </w:r>
-      <w:bookmarkStart w:id="130" w:name="_GoBack"/>
-      <w:bookmarkEnd w:id="130"/>
     </w:p>
     <w:p>
       <w:pPr>
@@ -711,54 +709,6 @@
     </w:p>
     <w:p>
       <w:pPr>
-        <w:rPr>
-          <w:rFonts w:hint="default"/>
-          <w:lang w:val="en-US"/>
-        </w:rPr>
-      </w:pPr>
-    </w:p>
-    <w:p>
-      <w:pPr>
-        <w:rPr>
-          <w:rFonts w:hint="default"/>
-          <w:lang w:val="en-US"/>
-        </w:rPr>
-      </w:pPr>
-    </w:p>
-    <w:p>
-      <w:pPr>
-        <w:rPr>
-          <w:rFonts w:hint="default"/>
-          <w:lang w:val="en-US"/>
-        </w:rPr>
-      </w:pPr>
-    </w:p>
-    <w:p>
-      <w:pPr>
-        <w:rPr>
-          <w:rFonts w:hint="default"/>
-          <w:lang w:val="en-US"/>
-        </w:rPr>
-      </w:pPr>
-    </w:p>
-    <w:p>
-      <w:pPr>
-        <w:rPr>
-          <w:rFonts w:hint="default"/>
-          <w:lang w:val="en-US"/>
-        </w:rPr>
-      </w:pPr>
-    </w:p>
-    <w:p>
-      <w:pPr>
-        <w:rPr>
-          <w:rFonts w:hint="default"/>
-          <w:lang w:val="en-US"/>
-        </w:rPr>
-      </w:pPr>
-    </w:p>
-    <w:p>
-      <w:pPr>
         <w:pStyle w:val="23"/>
         <w:keepNext w:val="0"/>
         <w:keepLines w:val="0"/>
@@ -825,9 +775,44 @@
           <w:bCs w:val="0"/>
         </w:rPr>
       </w:pPr>
-      <w:bookmarkStart w:id="2" w:name="_Toc216892171"/>
-      <w:bookmarkStart w:id="3" w:name="_Toc216892055"/>
-      <w:bookmarkStart w:id="4" w:name="_Toc201668569"/>
+      <w:bookmarkStart w:id="2" w:name="_Toc201668569"/>
+      <w:bookmarkStart w:id="3" w:name="_Toc216892171"/>
+      <w:bookmarkStart w:id="4" w:name="_Toc216892055"/>
+    </w:p>
+    <w:p>
+      <w:pPr>
+        <w:rPr>
+          <w:bCs w:val="0"/>
+        </w:rPr>
+      </w:pPr>
+    </w:p>
+    <w:p>
+      <w:pPr>
+        <w:rPr>
+          <w:bCs w:val="0"/>
+        </w:rPr>
+      </w:pPr>
+    </w:p>
+    <w:p>
+      <w:pPr>
+        <w:rPr>
+          <w:bCs w:val="0"/>
+        </w:rPr>
+      </w:pPr>
+    </w:p>
+    <w:p>
+      <w:pPr>
+        <w:rPr>
+          <w:bCs w:val="0"/>
+        </w:rPr>
+      </w:pPr>
+    </w:p>
+    <w:p>
+      <w:pPr>
+        <w:rPr>
+          <w:bCs w:val="0"/>
+        </w:rPr>
+      </w:pPr>
     </w:p>
     <w:p>
       <w:pPr>
@@ -1890,6 +1875,8 @@
             </w:rPr>
             <w:fldChar w:fldCharType="end"/>
           </w:r>
+          <w:bookmarkStart w:id="130" w:name="_GoBack"/>
+          <w:bookmarkEnd w:id="130"/>
         </w:p>
         <w:p>
           <w:pPr>
@@ -6676,8 +6663,8 @@
         <w:snapToGrid/>
         <w:textAlignment w:val="auto"/>
       </w:pPr>
-      <w:bookmarkStart w:id="11" w:name="_Toc216944084"/>
-      <w:bookmarkStart w:id="12" w:name="_Toc216892058"/>
+      <w:bookmarkStart w:id="11" w:name="_Toc216892058"/>
+      <w:bookmarkStart w:id="12" w:name="_Toc216944084"/>
       <w:r>
         <w:t>Motivations</w:t>
       </w:r>
@@ -6730,8 +6717,8 @@
         <w:snapToGrid/>
         <w:textAlignment w:val="auto"/>
       </w:pPr>
-      <w:bookmarkStart w:id="13" w:name="_Toc216892059"/>
-      <w:bookmarkStart w:id="14" w:name="_Toc216944085"/>
+      <w:bookmarkStart w:id="13" w:name="_Toc216944085"/>
+      <w:bookmarkStart w:id="14" w:name="_Toc216892059"/>
       <w:r>
         <w:t>Objectives</w:t>
       </w:r>
@@ -7087,8 +7074,8 @@
         <w:ind w:leftChars="0"/>
         <w:textAlignment w:val="auto"/>
       </w:pPr>
-      <w:bookmarkStart w:id="15" w:name="_Toc216944087"/>
-      <w:bookmarkStart w:id="16" w:name="_Toc216892061"/>
+      <w:bookmarkStart w:id="15" w:name="_Toc216892061"/>
+      <w:bookmarkStart w:id="16" w:name="_Toc216944087"/>
       <w:bookmarkStart w:id="17" w:name="_1.3. Overview"/>
       <w:r>
         <w:t>1.</w:t>
@@ -7445,8 +7432,8 @@
         <w:snapToGrid/>
         <w:textAlignment w:val="auto"/>
       </w:pPr>
-      <w:bookmarkStart w:id="21" w:name="_Toc216944089"/>
-      <w:bookmarkStart w:id="22" w:name="_Toc216892063"/>
+      <w:bookmarkStart w:id="21" w:name="_Toc216892063"/>
+      <w:bookmarkStart w:id="22" w:name="_Toc216944089"/>
       <w:bookmarkStart w:id="23" w:name="_Technology"/>
       <w:r>
         <w:t>Technology</w:t>
@@ -7472,8 +7459,8 @@
         <w:snapToGrid/>
         <w:textAlignment w:val="auto"/>
       </w:pPr>
-      <w:bookmarkStart w:id="24" w:name="_Java &amp; Spring Boot (Backend)"/>
-      <w:bookmarkStart w:id="25" w:name="_Node.js and Express.js"/>
+      <w:bookmarkStart w:id="24" w:name="_Node.js and Express.js"/>
+      <w:bookmarkStart w:id="25" w:name="_Java &amp; Spring Boot (Backend)"/>
       <w:r>
         <w:rPr>
           <w:rFonts w:hint="default"/>
@@ -7500,9 +7487,9 @@
         <w:textAlignment w:val="auto"/>
       </w:pPr>
       <w:bookmarkStart w:id="26" w:name="_Toc216944091"/>
-      <w:bookmarkStart w:id="27" w:name="_Toc216892181"/>
+      <w:bookmarkStart w:id="27" w:name="_Toc216931444"/>
       <w:bookmarkStart w:id="28" w:name="_Toc216892065"/>
-      <w:bookmarkStart w:id="29" w:name="_Toc216931444"/>
+      <w:bookmarkStart w:id="29" w:name="_Toc216892181"/>
       <w:r>
         <w:rPr>
           <w:rFonts w:hint="default"/>
@@ -8569,8 +8556,8 @@
         <w:jc w:val="both"/>
         <w:textAlignment w:val="auto"/>
       </w:pPr>
-      <w:bookmarkStart w:id="33" w:name="_Toc216892072"/>
-      <w:bookmarkStart w:id="34" w:name="_Toc216944098"/>
+      <w:bookmarkStart w:id="33" w:name="_Toc216944098"/>
+      <w:bookmarkStart w:id="34" w:name="_Toc216892072"/>
       <w:bookmarkStart w:id="35" w:name="_Strengths of the Website Based on Its Technology Stack"/>
       <w:r>
         <w:rPr>
@@ -9063,8 +9050,8 @@
           <w:tab w:val="left" w:pos="0"/>
         </w:tabs>
       </w:pPr>
-      <w:bookmarkStart w:id="38" w:name="_Toc216892074"/>
-      <w:bookmarkStart w:id="39" w:name="_Toc216944100"/>
+      <w:bookmarkStart w:id="38" w:name="_Toc216944100"/>
+      <w:bookmarkStart w:id="39" w:name="_Toc216892074"/>
       <w:r>
         <w:t>System Workflow</w:t>
       </w:r>
@@ -9075,8 +9062,8 @@
       <w:pPr>
         <w:pStyle w:val="4"/>
       </w:pPr>
-      <w:bookmarkStart w:id="40" w:name="_Toc216892075"/>
-      <w:bookmarkStart w:id="41" w:name="_Toc216944101"/>
+      <w:bookmarkStart w:id="40" w:name="_Toc216944101"/>
+      <w:bookmarkStart w:id="41" w:name="_Toc216892075"/>
       <w:r>
         <w:t>General Use Case Diagram</w:t>
       </w:r>
@@ -9093,13 +9080,13 @@
           <w:lang w:bidi="th-TH"/>
         </w:rPr>
       </w:pPr>
-      <w:bookmarkStart w:id="42" w:name="Fig1"/>
+      <w:bookmarkStart w:id="42" w:name="fig1"/>
       <w:r>
         <w:drawing>
           <wp:inline distT="0" distB="0" distL="114300" distR="114300">
-            <wp:extent cx="5756275" cy="5554980"/>
-            <wp:effectExtent l="0" t="0" r="4445" b="7620"/>
-            <wp:docPr id="9" name="Picture 1"/>
+            <wp:extent cx="5379720" cy="5668010"/>
+            <wp:effectExtent l="0" t="0" r="0" b="1270"/>
+            <wp:docPr id="1" name="Picture 1"/>
             <wp:cNvGraphicFramePr>
               <a:graphicFrameLocks xmlns:a="http://schemas.openxmlformats.org/drawingml/2006/main" noChangeAspect="1"/>
             </wp:cNvGraphicFramePr>
@@ -9107,7 +9094,7 @@
               <a:graphicData uri="http://schemas.openxmlformats.org/drawingml/2006/picture">
                 <pic:pic xmlns:pic="http://schemas.openxmlformats.org/drawingml/2006/picture">
                   <pic:nvPicPr>
-                    <pic:cNvPr id="9" name="Picture 1"/>
+                    <pic:cNvPr id="1" name="Picture 1"/>
                     <pic:cNvPicPr>
                       <a:picLocks noChangeAspect="1"/>
                     </pic:cNvPicPr>
@@ -9121,7 +9108,7 @@
                   <pic:spPr>
                     <a:xfrm>
                       <a:off x="0" y="0"/>
-                      <a:ext cx="5756275" cy="5554980"/>
+                      <a:ext cx="5379720" cy="5668010"/>
                     </a:xfrm>
                     <a:prstGeom prst="rect">
                       <a:avLst/>
@@ -10180,8 +10167,8 @@
         <w:spacing w:line="360" w:lineRule="auto"/>
         <w:textAlignment w:val="auto"/>
       </w:pPr>
-      <w:bookmarkStart w:id="46" w:name="_Health Monitoring Use Cases"/>
-      <w:bookmarkStart w:id="47" w:name="_Use Case Analysis for Student"/>
+      <w:bookmarkStart w:id="46" w:name="_Use Case Analysis for Student"/>
+      <w:bookmarkStart w:id="47" w:name="_Health Monitoring Use Cases"/>
       <w:r>
         <w:rPr>
           <w:rFonts w:hint="default"/>
@@ -11184,8 +11171,8 @@
       <w:pPr>
         <w:pStyle w:val="4"/>
       </w:pPr>
-      <w:bookmarkStart w:id="52" w:name="_Toc216892078"/>
-      <w:bookmarkStart w:id="53" w:name="_Toc216944104"/>
+      <w:bookmarkStart w:id="52" w:name="_Toc216944104"/>
+      <w:bookmarkStart w:id="53" w:name="_Toc216892078"/>
       <w:bookmarkStart w:id="54" w:name="_Activity Diagrams"/>
       <w:r>
         <w:t>Activity Diagrams</w:t>
@@ -12831,8 +12818,8 @@
         <w:snapToGrid/>
         <w:textAlignment w:val="auto"/>
       </w:pPr>
-      <w:bookmarkStart w:id="62" w:name="_Toc216892080"/>
-      <w:bookmarkStart w:id="63" w:name="_Toc216944106"/>
+      <w:bookmarkStart w:id="62" w:name="_Toc216944106"/>
+      <w:bookmarkStart w:id="63" w:name="_Toc216892080"/>
       <w:bookmarkStart w:id="64" w:name="_Users Table"/>
       <w:bookmarkStart w:id="65" w:name="_Lesson_questions Table"/>
       <w:r>
@@ -12928,10 +12915,10 @@
         <w:snapToGrid/>
         <w:textAlignment w:val="auto"/>
       </w:pPr>
-      <w:bookmarkStart w:id="66" w:name="_Toc216944107"/>
-      <w:bookmarkStart w:id="67" w:name="_Toc216892081"/>
-      <w:bookmarkStart w:id="68" w:name="_Lesson_options Table"/>
-      <w:bookmarkStart w:id="69" w:name="_OTP_Tokens Table"/>
+      <w:bookmarkStart w:id="66" w:name="_Toc216892081"/>
+      <w:bookmarkStart w:id="67" w:name="_Toc216944107"/>
+      <w:bookmarkStart w:id="68" w:name="_OTP_Tokens Table"/>
+      <w:bookmarkStart w:id="69" w:name="_Lesson_options Table"/>
       <w:r>
         <w:rPr>
           <w:rFonts w:hint="default"/>
@@ -13320,8 +13307,8 @@
         <w:spacing w:line="360" w:lineRule="auto"/>
         <w:textAlignment w:val="auto"/>
       </w:pPr>
-      <w:bookmarkStart w:id="80" w:name="_Toc216944111"/>
-      <w:bookmarkStart w:id="81" w:name="_Toc216892085"/>
+      <w:bookmarkStart w:id="80" w:name="_Toc216892085"/>
+      <w:bookmarkStart w:id="81" w:name="_Toc216944111"/>
       <w:r>
         <w:rPr>
           <w:rFonts w:hint="default"/>
@@ -13521,8 +13508,8 @@
       <w:pPr>
         <w:pStyle w:val="4"/>
       </w:pPr>
-      <w:bookmarkStart w:id="83" w:name="_Toc216892086"/>
-      <w:bookmarkStart w:id="84" w:name="_Toc216944112"/>
+      <w:bookmarkStart w:id="83" w:name="_Toc216944112"/>
+      <w:bookmarkStart w:id="84" w:name="_Toc216892086"/>
       <w:bookmarkStart w:id="85" w:name="_Relationships of Database"/>
       <w:r>
         <w:t>Relationships of Database</w:t>
@@ -16152,8 +16139,8 @@
         <w:snapToGrid/>
         <w:textAlignment w:val="auto"/>
       </w:pPr>
-      <w:bookmarkStart w:id="119" w:name="_Toc216892090"/>
-      <w:bookmarkStart w:id="120" w:name="_Toc216944117"/>
+      <w:bookmarkStart w:id="119" w:name="_Toc216944117"/>
+      <w:bookmarkStart w:id="120" w:name="_Toc216892090"/>
       <w:bookmarkStart w:id="121" w:name="_Conclusion and Future Works"/>
       <w:r>
         <w:t>Conclusion and Future Works</w:t>
@@ -16179,8 +16166,8 @@
         <w:snapToGrid/>
         <w:textAlignment w:val="auto"/>
       </w:pPr>
-      <w:bookmarkStart w:id="122" w:name="_Toc216892091"/>
-      <w:bookmarkStart w:id="123" w:name="_Toc216944118"/>
+      <w:bookmarkStart w:id="122" w:name="_Toc216944118"/>
+      <w:bookmarkStart w:id="123" w:name="_Toc216892091"/>
       <w:bookmarkStart w:id="124" w:name="_Conclusion"/>
       <w:r>
         <w:t>Conclusion</w:t>

</xml_diff>